<commit_message>
control panel and billing issues addressed
</commit_message>
<xml_diff>
--- a/MPower_CTS_Admin_Guide_Color.docx
+++ b/MPower_CTS_Admin_Guide_Color.docx
@@ -5108,6 +5108,61 @@
         </w:tc>
       </w:tr>
     </w:tbl>
+    <w:tbl>
+      <w:tblPr>
+        <w:tblW w:type="dxa" w:w="9000"/>
+        <w:tblBorders>
+          <w:top w:val="single" w:color="auto" w:sz="4"/>
+          <w:left w:val="single" w:color="auto" w:sz="4"/>
+          <w:bottom w:val="single" w:color="auto" w:sz="4"/>
+          <w:right w:val="single" w:color="auto" w:sz="4"/>
+          <w:insideH w:val="single" w:color="auto" w:sz="4"/>
+          <w:insideV w:val="single" w:color="auto" w:sz="4"/>
+        </w:tblBorders>
+      </w:tblPr>
+      <w:tblGrid>
+        <w:gridCol w:w="9000"/>
+      </w:tblGrid>
+      <w:tr>
+        <w:tc>
+          <w:tcPr>
+            <w:tcW w:type="dxa" w:w="9000"/>
+            <w:tcBorders>
+              <w:top w:val="none" w:color="FFFFFF" w:sz="0"/>
+              <w:left w:val="single" w:color="B8860B" w:sz="18"/>
+              <w:bottom w:val="none" w:color="FFFFFF" w:sz="0"/>
+              <w:right w:val="none" w:color="FFFFFF" w:sz="0"/>
+            </w:tcBorders>
+            <w:tcMar>
+              <w:top w:type="dxa" w:w="100"/>
+              <w:left w:type="dxa" w:w="200"/>
+              <w:bottom w:type="dxa" w:w="100"/>
+              <w:right w:type="dxa" w:w="100"/>
+            </w:tcMar>
+          </w:tcPr>
+          <w:p>
+            <w:r>
+              <w:rPr>
+                <w:b/>
+                <w:bCs/>
+                <w:color w:val="1A1A2E"/>
+                <w:sz w:val="20"/>
+                <w:szCs w:val="20"/>
+              </w:rPr>
+              <w:t xml:space="preserve">GOOD TO KNOW:  </w:t>
+            </w:r>
+            <w:r>
+              <w:rPr>
+                <w:color w:val="1F2937"/>
+                <w:sz w:val="20"/>
+                <w:szCs w:val="20"/>
+              </w:rPr>
+              <w:t xml:space="preserve">These same action buttons work identically whether you are on a phone, a desktop browser, or acting on a complaint from within Reports (Section 7) — all three reach the same underlying screen, so nothing is mobile-only.</w:t>
+            </w:r>
+          </w:p>
+        </w:tc>
+      </w:tr>
+    </w:tbl>
     <w:p>
       <w:pPr>
         <w:spacing w:before="200"/>
@@ -5765,7 +5820,7 @@
       <w:r>
         <w:drawing>
           <wp:inline distT="0" distB="0" distL="0" distR="0">
-            <wp:extent cx="3238500" cy="5391150"/>
+            <wp:extent cx="3238500" cy="5905500"/>
             <wp:effectExtent t="0" r="0" b="0" l="0"/>
             <wp:docPr id="1" name="" descr="" title=""/>
             <wp:cNvGraphicFramePr>
@@ -5790,7 +5845,7 @@
                   <pic:spPr bwMode="auto">
                     <a:xfrm>
                       <a:off x="0" y="0"/>
-                      <a:ext cx="3238500" cy="5391150"/>
+                      <a:ext cx="3238500" cy="5905500"/>
                     </a:xfrm>
                     <a:prstGeom prst="rect">
                       <a:avLst/>
@@ -5813,7 +5868,7 @@
           <w:sz w:val="21"/>
           <w:szCs w:val="21"/>
         </w:rPr>
-        <w:t xml:space="preserve">The four summary cards at the top — Total, Resolved, Pending, Escalated — give a fast, at-a-glance total. The four tabs let you regroup the same complaints by Category, Village, Mandal, or Constituency — switching between them never changes the data, only how it is organised. Each row can be tapped open to reveal the real complaints inside it, sorted so the longest-waiting one appears first.</w:t>
+        <w:t xml:space="preserve">The six summary cards at the top — Total, Resolved, Pending, Escalated, Declined, and Sanctioned — give a fast, at-a-glance total. Declined and Sanctioned both count toward Total but are excluded from Pending, since neither is still "open" work — without these two cards, Total would never quite add up to Resolved + Pending + Escalated, with nothing explaining the gap. The four tabs let you regroup the same complaints by Category, Village, Mandal, or Constituency — switching between them never changes the data, only how it is organised. Each row can be tapped open to reveal the real complaints inside it, sorted so the longest-waiting one appears first.</w:t>
       </w:r>
     </w:p>
     <w:tbl>

</xml_diff>